<commit_message>
da Doku + bild data flow
</commit_message>
<xml_diff>
--- a/Diplomarbeit/doc/htl-da-doku-de-ab2025-it-janik-gierer.docx
+++ b/Diplomarbeit/doc/htl-da-doku-de-ab2025-it-janik-gierer.docx
@@ -1,6 +1,6 @@
 
 <file path=word/document.xml><?xml version="1.0" encoding="utf-8"?>
-<w:document xmlns:wpc="http://schemas.microsoft.com/office/word/2010/wordprocessingCanvas" xmlns:cx="http://schemas.microsoft.com/office/drawing/2014/chartex" xmlns:cx1="http://schemas.microsoft.com/office/drawing/2015/9/8/chartex" xmlns:cx2="http://schemas.microsoft.com/office/drawing/2015/10/21/chartex" xmlns:cx3="http://schemas.microsoft.com/office/drawing/2016/5/9/chartex" xmlns:cx4="http://schemas.microsoft.com/office/drawing/2016/5/10/chartex" xmlns:cx5="http://schemas.microsoft.com/office/drawing/2016/5/11/chartex" xmlns:cx6="http://schemas.microsoft.com/office/drawing/2016/5/12/chartex" xmlns:cx7="http://schemas.microsoft.com/office/drawing/2016/5/13/chartex" xmlns:cx8="http://schemas.microsoft.com/office/drawing/2016/5/14/chartex" xmlns:mc="http://schemas.openxmlformats.org/markup-compatibility/2006" xmlns:aink="http://schemas.microsoft.com/office/drawing/2016/ink" xmlns:am3d="http://schemas.microsoft.com/office/drawing/2017/model3d" xmlns:o="urn:schemas-microsoft-com:office:office" xmlns:r="http://schemas.openxmlformats.org/officeDocument/2006/relationships" xmlns:m="http://schemas.openxmlformats.org/officeDocument/2006/math" xmlns:v="urn:schemas-microsoft-com:vml" xmlns:wp14="http://schemas.microsoft.com/office/word/2010/wordprocessingDrawing" xmlns:wp="http://schemas.openxmlformats.org/drawingml/2006/wordprocessingDrawing" xmlns:w10="urn:schemas-microsoft-com:office:word" xmlns:w="http://schemas.openxmlformats.org/wordprocessingml/2006/main" xmlns:w14="http://schemas.microsoft.com/office/word/2010/wordml" xmlns:w15="http://schemas.microsoft.com/office/word/2012/wordml" xmlns:w16cid="http://schemas.microsoft.com/office/word/2016/wordml/cid" xmlns:w16se="http://schemas.microsoft.com/office/word/2015/wordml/symex" xmlns:wpg="http://schemas.microsoft.com/office/word/2010/wordprocessingGroup" xmlns:wpi="http://schemas.microsoft.com/office/word/2010/wordprocessingInk" xmlns:wne="http://schemas.microsoft.com/office/word/2006/wordml" xmlns:wps="http://schemas.microsoft.com/office/word/2010/wordprocessingShape" mc:Ignorable="w14 w15 w16se w16cid wp14">
+<w:document xmlns:ns1="http://schemas.openxmlformats.org/markup-compatibility/2006" xmlns:ns2="http://schemas.openxmlformats.org/officeDocument/2006/relationships" xmlns:w="http://schemas.openxmlformats.org/wordprocessingml/2006/main" ns1:Ignorable="w14 w15 w16se w16cid wp14">
   <w:body>
     <w:p>
       <w:pPr>
@@ -124,23 +124,9 @@
             <w:vAlign w:val="center"/>
           </w:tcPr>
           <w:p>
-            <w:pPr>
-              <w:rPr>
-                <w:rFonts w:ascii="Arial" w:hAnsi="Arial" w:cs="Arial"/>
-                <w:sz w:val="22"/>
-                <w:szCs w:val="22"/>
-              </w:rPr>
-            </w:pPr>
-            <w:r>
-              <w:rPr>
-                <w:rFonts w:ascii="Arial" w:hAnsi="Arial" w:cs="Arial"/>
-                <w:sz w:val="22"/>
-                <w:szCs w:val="22"/>
-              </w:rPr>
-              <w:t>Name 1, Name 2</w:t>
-            </w:r>
-            <w:bookmarkStart w:id="0" w:name="_GoBack"/>
-            <w:bookmarkEnd w:id="0"/>
+            <w:r>
+              <w:t>Janik Gierer</w:t>
+            </w:r>
           </w:p>
         </w:tc>
       </w:tr>
@@ -193,84 +179,8 @@
             <w:vAlign w:val="center"/>
           </w:tcPr>
           <w:p>
-            <w:pPr>
-              <w:rPr>
-                <w:rFonts w:ascii="Arial" w:hAnsi="Arial" w:cs="Arial"/>
-                <w:sz w:val="22"/>
-                <w:szCs w:val="22"/>
-              </w:rPr>
-            </w:pPr>
-            <w:r>
-              <w:rPr>
-                <w:rFonts w:ascii="Arial" w:hAnsi="Arial" w:cs="Arial"/>
-                <w:sz w:val="22"/>
-                <w:szCs w:val="22"/>
-              </w:rPr>
-              <w:t>5AH</w:t>
-            </w:r>
-            <w:r>
-              <w:rPr>
-                <w:rFonts w:ascii="Arial" w:hAnsi="Arial" w:cs="Arial"/>
-                <w:sz w:val="22"/>
-                <w:szCs w:val="22"/>
-              </w:rPr>
-              <w:t>WIN</w:t>
-            </w:r>
-            <w:r>
-              <w:rPr>
-                <w:rFonts w:ascii="Arial" w:hAnsi="Arial" w:cs="Arial"/>
-                <w:sz w:val="22"/>
-                <w:szCs w:val="22"/>
-              </w:rPr>
-              <w:t xml:space="preserve">, </w:t>
-            </w:r>
-            <w:r>
-              <w:rPr>
-                <w:rFonts w:ascii="Arial" w:hAnsi="Arial" w:cs="Arial"/>
-                <w:sz w:val="22"/>
-                <w:szCs w:val="22"/>
-              </w:rPr>
-              <w:t>20</w:t>
-            </w:r>
-            <w:r>
-              <w:rPr>
-                <w:rFonts w:ascii="Arial" w:hAnsi="Arial" w:cs="Arial"/>
-                <w:sz w:val="22"/>
-                <w:szCs w:val="22"/>
-              </w:rPr>
-              <w:t>2</w:t>
-            </w:r>
-            <w:r>
-              <w:rPr>
-                <w:rFonts w:ascii="Arial" w:hAnsi="Arial" w:cs="Arial"/>
-                <w:sz w:val="22"/>
-                <w:szCs w:val="22"/>
-              </w:rPr>
-              <w:t>4</w:t>
-            </w:r>
-            <w:r>
-              <w:rPr>
-                <w:rFonts w:ascii="Arial" w:hAnsi="Arial" w:cs="Arial"/>
-                <w:sz w:val="22"/>
-                <w:szCs w:val="22"/>
-              </w:rPr>
-              <w:t>/</w:t>
-            </w:r>
-            <w:r>
-              <w:rPr>
-                <w:rFonts w:ascii="Arial" w:hAnsi="Arial" w:cs="Arial"/>
-                <w:sz w:val="22"/>
-                <w:szCs w:val="22"/>
-              </w:rPr>
-              <w:t>2</w:t>
-            </w:r>
-            <w:r>
-              <w:rPr>
-                <w:rFonts w:ascii="Arial" w:hAnsi="Arial" w:cs="Arial"/>
-                <w:sz w:val="22"/>
-                <w:szCs w:val="22"/>
-              </w:rPr>
-              <w:t>5</w:t>
+            <w:r>
+              <w:t>5AIT, 2025/26</w:t>
             </w:r>
           </w:p>
         </w:tc>
@@ -332,52 +242,8 @@
             <w:vAlign w:val="center"/>
           </w:tcPr>
           <w:p>
-            <w:pPr>
-              <w:rPr>
-                <w:rFonts w:ascii="Arial" w:hAnsi="Arial" w:cs="Arial"/>
-                <w:sz w:val="22"/>
-                <w:szCs w:val="22"/>
-              </w:rPr>
-            </w:pPr>
-            <w:r>
-              <w:rPr>
-                <w:rFonts w:ascii="Arial" w:hAnsi="Arial" w:cs="Arial"/>
-                <w:sz w:val="22"/>
-                <w:szCs w:val="22"/>
-              </w:rPr>
-              <w:t>Entwurf ei</w:t>
-            </w:r>
-            <w:r>
-              <w:rPr>
-                <w:rFonts w:ascii="Arial" w:hAnsi="Arial" w:cs="Arial"/>
-                <w:sz w:val="22"/>
-                <w:szCs w:val="22"/>
-              </w:rPr>
-              <w:t>nes Versuchsstandes für Kreisel</w:t>
-            </w:r>
-            <w:r>
-              <w:rPr>
-                <w:rFonts w:ascii="Arial" w:hAnsi="Arial" w:cs="Arial"/>
-                <w:sz w:val="22"/>
-                <w:szCs w:val="22"/>
-              </w:rPr>
-              <w:t xml:space="preserve">pumpen, welcher in </w:t>
-            </w:r>
-            <w:r>
-              <w:rPr>
-                <w:rFonts w:ascii="Arial" w:hAnsi="Arial" w:cs="Arial"/>
-                <w:sz w:val="22"/>
-                <w:szCs w:val="22"/>
-              </w:rPr>
-              <w:t>ebener</w:t>
-            </w:r>
-            <w:r>
-              <w:rPr>
-                <w:rFonts w:ascii="Arial" w:hAnsi="Arial" w:cs="Arial"/>
-                <w:sz w:val="22"/>
-                <w:szCs w:val="22"/>
-              </w:rPr>
-              <w:t xml:space="preserve"> Ausführung verbaut wird</w:t>
+            <w:r>
+              <w:t>Konzeption und Umsetzung eines modularen Smart-Home-Systems im Modellhaus mit Home Assistant, Node-RED, MQTT, Docker und Arduino.</w:t>
             </w:r>
           </w:p>
         </w:tc>
@@ -451,13 +317,9 @@
             <w:vAlign w:val="center"/>
           </w:tcPr>
           <w:p>
-            <w:pPr>
-              <w:rPr>
-                <w:rFonts w:ascii="Arial" w:hAnsi="Arial" w:cs="Arial"/>
-                <w:sz w:val="22"/>
-                <w:szCs w:val="22"/>
-              </w:rPr>
-            </w:pPr>
+            <w:r>
+              <w:t>Subthema: Smart Assistant Steuerung des Smart Homes; Verfasser: Janik Gierer; Klasse: 5AIT.</w:t>
+            </w:r>
           </w:p>
         </w:tc>
       </w:tr>
@@ -574,36 +436,8 @@
             <w:vAlign w:val="center"/>
           </w:tcPr>
           <w:p>
-            <w:pPr>
-              <w:rPr>
-                <w:rFonts w:ascii="Arial" w:hAnsi="Arial" w:cs="Arial"/>
-                <w:sz w:val="22"/>
-                <w:szCs w:val="22"/>
-              </w:rPr>
-            </w:pPr>
-            <w:r>
-              <w:rPr>
-                <w:rFonts w:ascii="Arial" w:hAnsi="Arial" w:cs="Arial"/>
-                <w:sz w:val="22"/>
-                <w:szCs w:val="22"/>
-              </w:rPr>
-              <w:t>voest</w:t>
-            </w:r>
-            <w:r>
-              <w:rPr>
-                <w:rFonts w:ascii="Arial" w:hAnsi="Arial" w:cs="Arial"/>
-                <w:sz w:val="22"/>
-                <w:szCs w:val="22"/>
-              </w:rPr>
-              <w:t>alpine</w:t>
-            </w:r>
-            <w:r>
-              <w:rPr>
-                <w:rFonts w:ascii="Arial" w:hAnsi="Arial" w:cs="Arial"/>
-                <w:sz w:val="22"/>
-                <w:szCs w:val="22"/>
-              </w:rPr>
-              <w:t xml:space="preserve"> Schienen GmbH, Donawitz</w:t>
+            <w:r>
+              <w:t>HTL Leoben, Abteilung Informationstechnologie (schulinternes Projekt ohne externen Industriepartner).</w:t>
             </w:r>
           </w:p>
         </w:tc>
@@ -641,13 +475,9 @@
             <w:vAlign w:val="center"/>
           </w:tcPr>
           <w:p>
-            <w:pPr>
-              <w:rPr>
-                <w:rFonts w:ascii="Arial" w:hAnsi="Arial" w:cs="Arial"/>
-                <w:sz w:val="22"/>
-                <w:szCs w:val="22"/>
-              </w:rPr>
-            </w:pPr>
+            <w:r>
+              <w:t>Dipl.-Wirt.-Ing. (FH) Christoph Leitner, BEd; DI Dr. mont Thomas Messner.</w:t>
+            </w:r>
           </w:p>
         </w:tc>
       </w:tr>
@@ -704,46 +534,9 @@
             <w:vAlign w:val="center"/>
           </w:tcPr>
           <w:p>
-            <w:pPr>
-              <w:rPr>
-                <w:rFonts w:ascii="Arial" w:hAnsi="Arial" w:cs="Arial"/>
-              </w:rPr>
-            </w:pPr>
-          </w:p>
-          <w:p>
-            <w:pPr>
-              <w:rPr>
-                <w:rFonts w:ascii="Arial" w:hAnsi="Arial" w:cs="Arial"/>
-              </w:rPr>
-            </w:pPr>
-          </w:p>
-          <w:p>
-            <w:pPr>
-              <w:rPr>
-                <w:rFonts w:ascii="Arial" w:hAnsi="Arial" w:cs="Arial"/>
-              </w:rPr>
-            </w:pPr>
-          </w:p>
-          <w:p>
-            <w:pPr>
-              <w:rPr>
-                <w:rFonts w:ascii="Arial" w:hAnsi="Arial" w:cs="Arial"/>
-              </w:rPr>
-            </w:pPr>
-          </w:p>
-          <w:p>
-            <w:pPr>
-              <w:rPr>
-                <w:rFonts w:ascii="Arial" w:hAnsi="Arial" w:cs="Arial"/>
-              </w:rPr>
-            </w:pPr>
-          </w:p>
-          <w:p>
-            <w:pPr>
-              <w:rPr>
-                <w:rFonts w:ascii="Arial" w:hAnsi="Arial" w:cs="Arial"/>
-              </w:rPr>
-            </w:pPr>
+            <w:r>
+              <w:t>Planung und Realisierung der zentralen Smart-Home-Steuerung auf Raspberry Pi; Aufbau der Containerdienste (Home Assistant, MQTT, Portainer), Entwicklung von Node-RED-Flows und MQTT-Topics, Integration von Arduino Uno via StandardFirmata sowie Dokumentation und Test der Automationsablaeufe.</w:t>
+            </w:r>
           </w:p>
         </w:tc>
       </w:tr>
@@ -816,39 +609,9 @@
             <w:vAlign w:val="center"/>
           </w:tcPr>
           <w:p>
-            <w:pPr>
-              <w:rPr>
-                <w:rFonts w:ascii="Arial" w:hAnsi="Arial" w:cs="Arial"/>
-              </w:rPr>
-            </w:pPr>
-          </w:p>
-          <w:p>
-            <w:pPr>
-              <w:rPr>
-                <w:rFonts w:ascii="Arial" w:hAnsi="Arial" w:cs="Arial"/>
-              </w:rPr>
-            </w:pPr>
-          </w:p>
-          <w:p>
-            <w:pPr>
-              <w:rPr>
-                <w:rFonts w:ascii="Arial" w:hAnsi="Arial" w:cs="Arial"/>
-              </w:rPr>
-            </w:pPr>
-          </w:p>
-          <w:p>
-            <w:pPr>
-              <w:rPr>
-                <w:rFonts w:ascii="Arial" w:hAnsi="Arial" w:cs="Arial"/>
-              </w:rPr>
-            </w:pPr>
-          </w:p>
-          <w:p>
-            <w:pPr>
-              <w:rPr>
-                <w:rFonts w:ascii="Arial" w:hAnsi="Arial" w:cs="Arial"/>
-              </w:rPr>
-            </w:pPr>
+            <w:r>
+              <w:t>Schrittweiser Aufbau mit Docker Compose auf dem Raspberry Pi, Definition einer dreistufigen Architektur (Feldebene, Verarbeitungsebene, Managementebene), Umsetzung von Licht- und Sensorautomationen, Dashboard-Visualisierung in Home Assistant und laufende Fehleranalyse (seriell/MQTT).</w:t>
+            </w:r>
           </w:p>
         </w:tc>
       </w:tr>
@@ -913,67 +676,9 @@
             <w:vAlign w:val="center"/>
           </w:tcPr>
           <w:p>
-            <w:pPr>
-              <w:rPr>
-                <w:rFonts w:ascii="Arial" w:hAnsi="Arial" w:cs="Arial"/>
-              </w:rPr>
-            </w:pPr>
-          </w:p>
-          <w:p>
-            <w:pPr>
-              <w:rPr>
-                <w:rFonts w:ascii="Arial" w:hAnsi="Arial" w:cs="Arial"/>
-              </w:rPr>
-            </w:pPr>
-          </w:p>
-          <w:p>
-            <w:pPr>
-              <w:rPr>
-                <w:rFonts w:ascii="Arial" w:hAnsi="Arial" w:cs="Arial"/>
-              </w:rPr>
-            </w:pPr>
-          </w:p>
-          <w:p>
-            <w:pPr>
-              <w:rPr>
-                <w:rFonts w:ascii="Arial" w:hAnsi="Arial" w:cs="Arial"/>
-              </w:rPr>
-            </w:pPr>
-          </w:p>
-          <w:p>
-            <w:pPr>
-              <w:rPr>
-                <w:rFonts w:ascii="Arial" w:hAnsi="Arial" w:cs="Arial"/>
-              </w:rPr>
-            </w:pPr>
-          </w:p>
-          <w:p>
-            <w:pPr>
-              <w:rPr>
-                <w:rFonts w:ascii="Arial" w:hAnsi="Arial" w:cs="Arial"/>
-              </w:rPr>
-            </w:pPr>
-          </w:p>
-          <w:p>
-            <w:pPr>
-              <w:rPr>
-                <w:rFonts w:ascii="Arial" w:hAnsi="Arial" w:cs="Arial"/>
-              </w:rPr>
-            </w:pPr>
-          </w:p>
-          <w:p>
-            <w:pPr>
-              <w:rPr>
-                <w:rFonts w:ascii="Arial" w:hAnsi="Arial" w:cs="Arial"/>
-              </w:rPr>
-            </w:pPr>
-          </w:p>
-          <w:p>
-            <w:pPr>
-              <w:rPr>
-                <w:rFonts w:ascii="Arial" w:hAnsi="Arial" w:cs="Arial"/>
-              </w:rPr>
-            </w:pPr>
+            <w:r>
+              <w:t>Funktionsfaehiges, modulares Smart-Home-Modell mit reproduzierbarer Inbetriebnahme; stabile Kommunikation zwischen Arduino, Node-RED, MQTT und Home Assistant; dokumentierte Use Cases fuer Lichtsteuerung, Sensordatenerfassung und manuelle Bedienung.</w:t>
+            </w:r>
           </w:p>
         </w:tc>
       </w:tr>
@@ -1055,32 +760,9 @@
             <w:vAlign w:val="center"/>
           </w:tcPr>
           <w:p>
-            <w:pPr>
-              <w:rPr>
-                <w:rFonts w:ascii="Arial" w:hAnsi="Arial" w:cs="Arial"/>
-              </w:rPr>
-            </w:pPr>
-          </w:p>
-          <w:p>
-            <w:pPr>
-              <w:rPr>
-                <w:rFonts w:ascii="Arial" w:hAnsi="Arial" w:cs="Arial"/>
-              </w:rPr>
-            </w:pPr>
-          </w:p>
-          <w:p>
-            <w:pPr>
-              <w:rPr>
-                <w:rFonts w:ascii="Arial" w:hAnsi="Arial" w:cs="Arial"/>
-              </w:rPr>
-            </w:pPr>
-          </w:p>
-          <w:p>
-            <w:pPr>
-              <w:rPr>
-                <w:rFonts w:ascii="Arial" w:hAnsi="Arial" w:cs="Arial"/>
-              </w:rPr>
-            </w:pPr>
+            <w:r>
+              <w:t>Systemarchitekturdiagramm: Sensor/Aktor &lt;-&gt; Arduino Uno (Firmata) &lt;-&gt; Node-RED &lt;-&gt; MQTT-Broker &lt;-&gt; Home Assistant; Darstellung des vollstaendigen Datenflusses vom Signal bis zur Visualisierung.</w:t>
+            </w:r>
           </w:p>
         </w:tc>
       </w:tr>
@@ -1156,11 +838,9 @@
             <w:vAlign w:val="center"/>
           </w:tcPr>
           <w:p>
-            <w:pPr>
-              <w:rPr>
-                <w:rFonts w:ascii="Arial" w:hAnsi="Arial" w:cs="Arial"/>
-              </w:rPr>
-            </w:pPr>
+            <w:r>
+              <w:t>Derzeit keine Teilnahme an Wettbewerben oder Auszeichnungen geplant.</w:t>
+            </w:r>
           </w:p>
         </w:tc>
       </w:tr>
@@ -1219,11 +899,9 @@
             <w:vAlign w:val="center"/>
           </w:tcPr>
           <w:p>
-            <w:pPr>
-              <w:rPr>
-                <w:rFonts w:ascii="Arial" w:hAnsi="Arial" w:cs="Arial"/>
-              </w:rPr>
-            </w:pPr>
+            <w:r>
+              <w:t>Einsicht ueber das Diplomarbeitsportal der HTL Leoben, interne Projektdokumentation (Git-Repository) sowie gedruckte Fassung im Schularchiv.</w:t>
+            </w:r>
           </w:p>
         </w:tc>
       </w:tr>
@@ -1783,8 +1461,8 @@
       </w:pPr>
     </w:p>
     <w:sectPr>
-      <w:headerReference w:type="default" r:id="rId6"/>
-      <w:footerReference w:type="default" r:id="rId7"/>
+      <w:headerReference w:type="default" ns2:id="rId6"/>
+      <w:footerReference w:type="default" ns2:id="rId7"/>
       <w:pgSz w:w="11906" w:h="16838"/>
       <w:pgMar w:top="1134" w:right="1134" w:bottom="1134" w:left="1134" w:header="709" w:footer="709" w:gutter="0"/>
       <w:cols w:space="708"/>

</xml_diff>